<commit_message>
Chapter 3 Subtle Field completed.
</commit_message>
<xml_diff>
--- a/resources/essenceOfStoneENWithTOC.docx
+++ b/resources/essenceOfStoneENWithTOC.docx
@@ -2727,7 +2727,7 @@
     <w:p>
       <w:pPr>
         <w:rPr>
-          <w:lang w:val="ru-RU"/>
+          <w:lang w:val="en-US"/>
         </w:rPr>
       </w:pPr>
       <w:r>
@@ -4327,7 +4327,13 @@
     <w:p>
       <w:r>
         <w:lastRenderedPageBreak/>
-        <w:t>“Now for another important device—perhaps the most important one of all. The quint-pump. It’s built into the box itself and doesn’t run on electricity, but on Essence drawn from the box. Like the Essence field sensor, the quint-pump only functions when the user’s Essence level is above a certain threshold—more precisely, above 187 quints. That’s why ordinary people can’t use these devices. Technically, they could—but only if their Essence level were constantly maintained at 187 quints, and doing that would consume nearly all the energy the pump collects. At that point, the whole process becomes pointless.”</w:t>
+        <w:t xml:space="preserve">“Now for another important device—perhaps the most important one of all. The quint-pump. It’s built into the box itself and doesn’t run on electricity, but on Essence drawn from the box. Like the Essence field sensor, the quint-pump only functions when the user’s Essence level is above a certain threshold—more precisely, above 187 quints. That’s why ordinary people can’t use these devices. Technically, they could—but only if their Essence level were constantly maintained at 187 quints, and doing that would consume nearly all the </w:t>
+      </w:r>
+      <w:r>
+        <w:t>Essence</w:t>
+      </w:r>
+      <w:r>
+        <w:t xml:space="preserve"> the pump collects. At that point, the whole process becomes pointless.”</w:t>
       </w:r>
     </w:p>
     <w:p>
@@ -4372,27 +4378,7 @@
     </w:p>
     <w:p>
       <w:r>
-        <w:t xml:space="preserve">In the corner of my Mask’s display, a green icon appeared: the box. The number next to it read </w:t>
-      </w:r>
-      <w:r>
-        <w:rPr>
-          <w:b/>
-          <w:bCs/>
-        </w:rPr>
-        <w:t>0</w:t>
-      </w:r>
-      <w:r>
-        <w:t xml:space="preserve">. Near the stone, a floating annotation popped up, ending in two values: </w:t>
-      </w:r>
-      <w:r>
-        <w:rPr>
-          <w:b/>
-          <w:bCs/>
-        </w:rPr>
-        <w:t>124q, 36α</w:t>
-      </w:r>
-      <w:r>
-        <w:t>. I understood these as the nugget’s depth in quints and its capacity in amphoras.</w:t>
+        <w:t>In the corner of my Mask’s display, a green icon appeared: the box. The number next to it read 0. Near the stone, a floating annotation popped up, ending in two values: 124q, 36α. I understood these as the nugget’s depth in quints and its capacity in amphoras.</w:t>
       </w:r>
     </w:p>
     <w:p>
@@ -4442,10 +4428,7 @@
     </w:p>
     <w:p>
       <w:r>
-        <w:t xml:space="preserve">The numbers on the box icon began to climb: </w:t>
-      </w:r>
-      <w:r>
-        <w:t>1α… 2α… 3α…</w:t>
+        <w:t>The numbers on the box icon began to climb: 1α… 2α… 3α…</w:t>
       </w:r>
     </w:p>
     <w:p>
@@ -4456,31 +4439,12 @@
     <w:p>
       <w:r>
         <w:lastRenderedPageBreak/>
-        <w:t xml:space="preserve">Art disconnected the tackle when the box reached </w:t>
-      </w:r>
-      <w:r>
-        <w:rPr>
-          <w:b/>
-          <w:bCs/>
-        </w:rPr>
-        <w:t>24 amphoras</w:t>
-      </w:r>
-      <w:r>
-        <w:t xml:space="preserve">, and the nugget’s indicators settled at </w:t>
-      </w:r>
-      <w:r>
-        <w:t>106q, 8α.</w:t>
-      </w:r>
-    </w:p>
-    <w:p>
-      <w:r>
-        <w:t xml:space="preserve">“As you can see,” he said, “when the depth is low, the process is slow—and the speed drops exponentially. On top of that, the percentage of losses increases. More and more Essence simply dissipates into the surrounding space. </w:t>
-      </w:r>
-      <w:r>
-        <w:t>Picking nuggets below 105 quints isn’t worth it—it takes too much time, especially once the box is partially filled. And extracting anything below 100 quints is impossible altogether.</w:t>
-      </w:r>
-      <w:r>
-        <w:t>”</w:t>
+        <w:t>Art disconnected the tackle when the box reached 24 amphoras, and the nugget’s indicators settled at 106q, 8α.</w:t>
+      </w:r>
+    </w:p>
+    <w:p>
+      <w:r>
+        <w:t>“As you can see,” he said, “when the depth is low, the process is slow—and the speed drops exponentially. On top of that, the percentage of losses increases. More and more Essence simply dissipates into the surrounding space. Picking nuggets below 105 quints isn’t worth it—it takes too much time, especially once the box is partially filled. And extracting anything below 100 quints is impossible altogether.”</w:t>
       </w:r>
     </w:p>
     <w:p>
@@ -4505,10 +4469,7 @@
     </w:p>
     <w:p>
       <w:r>
-        <w:t>When we finished picking the last nugget</w:t>
-      </w:r>
-      <w:r>
-        <w:t>, Art said:</w:t>
+        <w:t>When we finished picking the last nugget, Art said:</w:t>
       </w:r>
     </w:p>
     <w:p>
@@ -4533,13 +4494,7 @@
     </w:p>
     <w:p>
       <w:r>
-        <w:t xml:space="preserve">“About ten years. I don’t remember exactly. When the Gates appeared, we—like everyone else—immediately rushed to study them. But unlike the other Variants, we managed to learn how to see and </w:t>
-      </w:r>
-      <w:r>
-        <w:t>collect</w:t>
-      </w:r>
-      <w:r>
-        <w:t xml:space="preserve"> Essence, and most importantly, to understand what it actually is and what it can be used for. After that, things moved very fast. The first strider was identified, then gradually the rest. Striders began walking through the Gates, bringing back information about other Variants. That’s how we figured out the structure of the Delta of Worlds. Then the striders split into Reds and Greens. ARC was created and organized the work of us Greens. Altogether, it took about five years.”</w:t>
+        <w:t>“About ten years. I don’t remember exactly. When the Gates appeared, we—like everyone else—immediately rushed to study them. But unlike the other Variants, we managed to learn how to see and collect Essence, and most importantly, to understand what it actually is and what it can be used for. After that, things moved very fast. The first strider was identified, then gradually the rest. Striders began walking through the Gates, bringing back information about other Variants. That’s how we figured out the structure of the Delta of Worlds. Then the striders split into Reds and Greens. ARC was created and organized the work of us Greens. Altogether, it took about five years.”</w:t>
       </w:r>
     </w:p>
     <w:p>
@@ -4549,7 +4504,10 @@
     </w:p>
     <w:p>
       <w:r>
-        <w:t>“Your Variant is classified as closed. That means we striders hide ourselves and our activities from the locals. There are open Variants as well—places where everyone knows about us. But here, we’ve been keeping a low profile, and I think we’ve managed to do that successfully. Still, to operate properly, we need a lot from your world—from basic information about how things work, all the way to money and documents. So we gradually recruited and trained the right people—agents—who now provide us with everything we need. Some of them are locals who agreed to confidentiality. Others were brought through the Gates after having their Essence boosted.”</w:t>
+        <w:t>“Your Variant is classified as closed. That means we striders hide ourselves and our activities from the locals. There are open Variants as well—places where everyone knows about us.</w:t>
+      </w:r>
+      <w:r>
+        <w:t xml:space="preserve"> But here, we’ve been keeping a low profile, and I think we’ve managed to do that successfully. Still, to operate properly, we need a lot from your world—from basic information about how things work, all the way to money and documents. So we gradually recruited and trained the right people—agents—who now provide us with everything we need. Some of them are locals who agreed to confidentiality. Others were brought through the Gates after having their Essence boosted.”</w:t>
       </w:r>
     </w:p>
     <w:p>

</xml_diff>